<commit_message>
HĐKT Hoàng Minh R10.2: bỏ điều khoản tạm ứng phí đổ thải (7.1 b1) theo chủ trương lãnh đạo
Co-Authored-By: Claude Opus 5.5 <noreply@anthropic.com>
Claude-Session: https://claude.ai/code/session_01Mg1rUEnT1XyuF11sZBr4uL
</commit_message>
<xml_diff>
--- a/3. DỰ THẢO HĐ/09-10 HĐKT VNCN - Hoàng Minh R10.2 (track changes).docx
+++ b/3. DỰ THẢO HĐ/09-10 HĐKT VNCN - Hoàng Minh R10.2 (track changes).docx
@@ -6877,22 +6877,28 @@
         </w:tabs>
         <w:spacing w:line="276" w:lineRule="auto"/>
         <w:rPr>
-          <w:ins w:id="9004" w:author="BCH Yên Sở" w:date="2026-10-09T09:00:00Z"/>
-          <w:sz w:val="25"/>
-          <w:szCs w:val="25"/>
-        </w:rPr>
-      </w:pPr>
-      <w:ins w:id="9005" w:author="BCH Yên Sở" w:date="2026-10-09T09:00:00Z">
-        <w:r>
-          <w:rPr>
-            <w:rFonts w:cs="Times New Roman"/>
-            <w:color w:val="000000" w:themeColor="text1"/>
-            <w:sz w:val="25"/>
-            <w:szCs w:val="25"/>
-          </w:rPr>
-          <w:t xml:space="preserve">b1) Tạm ứng phí tiếp nhận tại Bãi Đổ Thải: Ngoài khoản tạm ứng tại điểm b, Bên A tạm ứng cho Bên B phí tiếp nhận tại Bãi Đổ Thải theo từng đợt khi đáp ứng đủ các điều kiện sau:</w:t>
-        </w:r>
-      </w:ins>
+          <w:sz w:val="25"/>
+          <w:szCs w:val="25"/>
+        </w:rPr>
+      </w:pPr>
+      <w:r>
+        <w:rPr>
+          <w:rFonts w:cs="Times New Roman"/>
+          <w:color w:val="000000" w:themeColor="text1"/>
+          <w:sz w:val="25"/>
+          <w:szCs w:val="25"/>
+        </w:rPr>
+        <w:t xml:space="preserve">c) Thu hồi tạm ứng: </w:t>
+      </w:r>
+      <w:r>
+        <w:rPr>
+          <w:iCs/>
+          <w:color w:val="000000" w:themeColor="text1"/>
+          <w:sz w:val="25"/>
+          <w:szCs w:val="25"/>
+        </w:rPr>
+        <w:t xml:space="preserve">Số tiền khấu trừ tạm ứng = Giá trị đề nghị thanh toán của đợt đó x (Tổng số tiền đã tạm ứng / Tổng giá trị hợp đồng). Tiền tạm ứng sẽ được thu hồi toàn bộ (thu hồi hết) khi tổng giá trị thanh toán lũy kế đạt đến 80% giá trị hợp đồng; tại đợt thanh toán đó, Bên A khấu trừ toàn bộ phần tạm ứng còn lại chưa thu hồi.</w:t>
+      </w:r>
     </w:p>
     <w:p>
       <w:pPr>
@@ -6902,137 +6908,6 @@
         </w:tabs>
         <w:spacing w:line="276" w:lineRule="auto"/>
         <w:rPr>
-          <w:ins w:id="9006" w:author="BCH Yên Sở" w:date="2026-10-09T09:00:00Z"/>
-          <w:sz w:val="25"/>
-          <w:szCs w:val="25"/>
-        </w:rPr>
-      </w:pPr>
-      <w:ins w:id="9007" w:author="BCH Yên Sở" w:date="2026-10-09T09:00:00Z">
-        <w:r>
-          <w:rPr>
-            <w:rFonts w:cs="Times New Roman"/>
-            <w:color w:val="000000" w:themeColor="text1"/>
-            <w:sz w:val="25"/>
-            <w:szCs w:val="25"/>
-          </w:rPr>
-          <w:t xml:space="preserve">(i) Khối lượng Chất Thải của đợt đề nghị tạm ứng đã được xác nhận đồng thời bởi: (1) Bên A và Bên B (biên bản xác nhận khối lượng lập trên cơ sở nhật ký vận chuyển, phiếu xuất Chất Thải tại cổng và dữ liệu GPS theo điểm c(iv) khoản 8.3); và (2) chủ Bãi Đổ Thải (phiếu, bảng kê hoặc biên bản tiếp nhận theo điểm c(i) hoặc c(ii) khoản 8.3);</w:t>
-        </w:r>
-      </w:ins>
-    </w:p>
-    <w:p>
-      <w:pPr>
-        <w:widowControl w:val="0"/>
-        <w:tabs>
-          <w:tab w:val="left" w:pos="720"/>
-        </w:tabs>
-        <w:spacing w:line="276" w:lineRule="auto"/>
-        <w:rPr>
-          <w:ins w:id="9008" w:author="BCH Yên Sở" w:date="2026-10-09T09:00:00Z"/>
-          <w:sz w:val="25"/>
-          <w:szCs w:val="25"/>
-        </w:rPr>
-      </w:pPr>
-      <w:ins w:id="9009" w:author="BCH Yên Sở" w:date="2026-10-09T09:00:00Z">
-        <w:r>
-          <w:rPr>
-            <w:rFonts w:cs="Times New Roman"/>
-            <w:color w:val="000000" w:themeColor="text1"/>
-            <w:sz w:val="25"/>
-            <w:szCs w:val="25"/>
-          </w:rPr>
-          <w:t xml:space="preserve">(ii) Giá trị tạm ứng mỗi đợt = Khối lượng được xác nhận theo điểm (i) (quy đổi theo hệ số tại ghi chú 4 Phụ lục A) × 25.000 đồng/m³ (đơn giá phí tiếp nhận tại Bãi Đổ Thải đã bao gồm trong Đơn Giá Cố Định). Tổng giá trị tạm ứng phí tiếp nhận chưa thu hồi tại mọi thời điểm không vượt quá [500.000.000] đồng;</w:t>
-        </w:r>
-      </w:ins>
-    </w:p>
-    <w:p>
-      <w:pPr>
-        <w:widowControl w:val="0"/>
-        <w:tabs>
-          <w:tab w:val="left" w:pos="720"/>
-        </w:tabs>
-        <w:spacing w:line="276" w:lineRule="auto"/>
-        <w:rPr>
-          <w:ins w:id="9010" w:author="BCH Yên Sở" w:date="2026-10-09T09:00:00Z"/>
-          <w:sz w:val="25"/>
-          <w:szCs w:val="25"/>
-        </w:rPr>
-      </w:pPr>
-      <w:ins w:id="9011" w:author="BCH Yên Sở" w:date="2026-10-09T09:00:00Z">
-        <w:r>
-          <w:rPr>
-            <w:rFonts w:cs="Times New Roman"/>
-            <w:color w:val="000000" w:themeColor="text1"/>
-            <w:sz w:val="25"/>
-            <w:szCs w:val="25"/>
-          </w:rPr>
-          <w:t xml:space="preserve">(iii) Bên A có quyền lựa chọn chuyển tiền tạm ứng cho Bên B hoặc chuyển trực tiếp vào tài khoản của chủ Bãi Đổ Thải theo đề nghị và ủy quyền bằng văn bản của Bên B. Việc chuyển trực tiếp là thực hiện thay nghĩa vụ thanh toán của Bên B, không làm phát sinh quan hệ hợp đồng, nghĩa vụ hay trách nhiệm nào giữa Bên A và chủ Bãi Đổ Thải và không làm thay đổi tư cách Bên B là bên giao Chất Thải;</w:t>
-        </w:r>
-      </w:ins>
-    </w:p>
-    <w:p>
-      <w:pPr>
-        <w:widowControl w:val="0"/>
-        <w:tabs>
-          <w:tab w:val="left" w:pos="720"/>
-        </w:tabs>
-        <w:spacing w:line="276" w:lineRule="auto"/>
-        <w:rPr>
-          <w:ins w:id="9012" w:author="BCH Yên Sở" w:date="2026-10-09T09:00:00Z"/>
-          <w:sz w:val="25"/>
-          <w:szCs w:val="25"/>
-        </w:rPr>
-      </w:pPr>
-      <w:ins w:id="9013" w:author="BCH Yên Sở" w:date="2026-10-09T09:00:00Z">
-        <w:r>
-          <w:rPr>
-            <w:rFonts w:cs="Times New Roman"/>
-            <w:color w:val="000000" w:themeColor="text1"/>
-            <w:sz w:val="25"/>
-            <w:szCs w:val="25"/>
-          </w:rPr>
-          <w:t xml:space="preserve">(iv) Bên A chuyển tiền trong vòng 05 (năm) ngày làm việc kể từ ngày nhận đủ hồ sơ hợp lệ. Giá trị tạm ứng phí tiếp nhận của mỗi đợt được thu hồi toàn bộ vào kỳ thanh toán gần nhất của Bên B, độc lập với việc thu hồi tạm ứng tại điểm c.</w:t>
-        </w:r>
-      </w:ins>
-    </w:p>
-    <w:p>
-      <w:pPr>
-        <w:widowControl w:val="0"/>
-        <w:tabs>
-          <w:tab w:val="left" w:pos="720"/>
-        </w:tabs>
-        <w:spacing w:line="276" w:lineRule="auto"/>
-        <w:rPr>
-          <w:sz w:val="25"/>
-          <w:szCs w:val="25"/>
-        </w:rPr>
-      </w:pPr>
-      <w:r>
-        <w:rPr>
-          <w:rFonts w:cs="Times New Roman"/>
-          <w:color w:val="000000" w:themeColor="text1"/>
-          <w:sz w:val="25"/>
-          <w:szCs w:val="25"/>
-        </w:rPr>
-        <w:t xml:space="preserve">c) Thu hồi tạm ứng: </w:t>
-      </w:r>
-      <w:r>
-        <w:rPr>
-          <w:iCs/>
-          <w:color w:val="000000" w:themeColor="text1"/>
-          <w:sz w:val="25"/>
-          <w:szCs w:val="25"/>
-        </w:rPr>
-        <w:t xml:space="preserve">Số tiền khấu trừ tạm ứng = Giá trị đề nghị thanh toán của đợt đó x (Tổng số tiền đã tạm ứng / Tổng giá trị hợp đồng). Tiền tạm ứng sẽ được thu hồi toàn bộ (thu hồi hết) khi tổng giá trị thanh toán lũy kế đạt đến 80% giá trị hợp đồng; tại đợt thanh toán đó, Bên A khấu trừ toàn bộ phần tạm ứng còn lại chưa thu hồi.</w:t>
-      </w:r>
-    </w:p>
-    <w:p>
-      <w:pPr>
-        <w:widowControl w:val="0"/>
-        <w:tabs>
-          <w:tab w:val="left" w:pos="720"/>
-        </w:tabs>
-        <w:spacing w:line="276" w:lineRule="auto"/>
-        <w:rPr>
           <w:sz w:val="25"/>
           <w:szCs w:val="25"/>
         </w:rPr>
@@ -7082,27 +6957,7 @@
           <w:sz w:val="25"/>
           <w:szCs w:val="25"/>
         </w:rPr>
-        <w:t xml:space="preserve"> khoản này khi tạm ứng chưa được thu hồi đủ, Bên B phải hoàn trả toàn bộ phần tạm ứng chưa thu hồi</w:t>
-      </w:r>
-      <w:ins w:id="9014" w:author="BCH Yên Sở" w:date="2026-10-09T09:00:00Z">
-        <w:r>
-          <w:rPr>
-            <w:rFonts w:cs="Times New Roman"/>
-            <w:color w:val="000000" w:themeColor="text1"/>
-            <w:sz w:val="25"/>
-            <w:szCs w:val="25"/>
-          </w:rPr>
-          <w:t xml:space="preserve"> (bao gồm cả tạm ứng phí tiếp nhận theo điểm b1)</w:t>
-        </w:r>
-      </w:ins>
-      <w:r>
-        <w:rPr>
-          <w:rFonts w:cs="Times New Roman"/>
-          <w:color w:val="000000" w:themeColor="text1"/>
-          <w:sz w:val="25"/>
-          <w:szCs w:val="25"/>
-        </w:rPr>
-        <w:t xml:space="preserve"> trong vòng </w:t>
+        <w:t xml:space="preserve"> khoản này khi tạm ứng chưa được thu hồi đủ, Bên B phải hoàn trả toàn bộ phần tạm ứng chưa thu hồi trong vòng </w:t>
       </w:r>
       <w:r>
         <w:rPr>
@@ -7717,7 +7572,7 @@
         </w:rPr>
         <w:t xml:space="preserve"> (iii) toàn bộ Chứng Từ Đổ Thải Hợp Lệ theo điểm c khoản 8.3 và dữ liệu hành trình (GPS) của phương tiện trong kỳ. Phần khối lượng thiếu chứng từ không đủ điều kiện thanh toán</w:t>
       </w:r>
-      <w:ins w:id="9015" w:author="BCH Yên Sở" w:date="2026-10-09T09:00:00Z">
+      <w:ins w:id="9004" w:author="BCH Yên Sở" w:date="2026-10-09T09:00:00Z">
         <w:r>
           <w:rPr>
             <w:color w:val="000000" w:themeColor="text1"/>
@@ -8172,7 +8027,7 @@
         </w:rPr>
         <w:t xml:space="preserve">- Đối với khối lượng công việc vận chuyển về các Bãi Đổ Thải, Bên B có trách nhiệm cung cấp (i) biên bản xác nhận khối lượng thực tế hàng tháng ký kết với đơn vị quản lý Bãi Đổ Thải; (ii) hóa đơn giá trị gia tăng đối với dịch vụ tiếp nhận và xử lý chất thải do Bãi Đổ Thải xuất cho Bên B</w:t>
       </w:r>
-      <w:ins w:id="9016" w:author="BCH Yên Sở" w:date="2026-10-09T09:00:00Z">
+      <w:ins w:id="9005" w:author="BCH Yên Sở" w:date="2026-10-09T09:00:00Z">
         <w:r>
           <w:rPr>
             <w:sz w:val="25"/>
@@ -9090,12 +8945,12 @@
         </w:tabs>
         <w:spacing w:line="276" w:lineRule="auto"/>
         <w:rPr>
-          <w:ins w:id="9017" w:author="BCH Yên Sở" w:date="2026-10-09T09:00:00Z"/>
-          <w:sz w:val="25"/>
-          <w:szCs w:val="25"/>
-        </w:rPr>
-      </w:pPr>
-      <w:ins w:id="9018" w:author="BCH Yên Sở" w:date="2026-10-09T09:00:00Z">
+          <w:ins w:id="9006" w:author="BCH Yên Sở" w:date="2026-10-09T09:00:00Z"/>
+          <w:sz w:val="25"/>
+          <w:szCs w:val="25"/>
+        </w:rPr>
+      </w:pPr>
+      <w:ins w:id="9007" w:author="BCH Yên Sở" w:date="2026-10-09T09:00:00Z">
         <w:r>
           <w:rPr>
             <w:rFonts w:cs="Times New Roman"/>
@@ -9899,7 +9754,7 @@
         </w:rPr>
         <w:t xml:space="preserve">, </w:t>
       </w:r>
-      <w:del w:id="9019" w:author="BCH Yên Sở" w:date="2026-10-09T09:00:00Z">
+      <w:del w:id="9008" w:author="BCH Yên Sở" w:date="2026-10-09T09:00:00Z">
         <w:r>
           <w:rPr>
             <w:rFonts w:cs="Times New Roman"/>
@@ -9911,7 +9766,7 @@
           <w:delText xml:space="preserve">thể hiện chủng loại (đất, đất thải, mùn khoan, bê tông đầu cọc)</w:delText>
         </w:r>
       </w:del>
-      <w:ins w:id="9020" w:author="BCH Yên Sở" w:date="2026-10-09T09:00:00Z">
+      <w:ins w:id="9009" w:author="BCH Yên Sở" w:date="2026-10-09T09:00:00Z">
         <w:r>
           <w:rPr>
             <w:rFonts w:cs="Times New Roman"/>
@@ -9933,7 +9788,7 @@
         </w:rPr>
         <w:t xml:space="preserve"> và khối lượng tiếp nhận không nhỏ hơn khối lượng đổ thải dự kiến</w:t>
       </w:r>
-      <w:ins w:id="9021" w:author="BCH Yên Sở" w:date="2026-10-09T09:00:00Z">
+      <w:ins w:id="9010" w:author="BCH Yên Sở" w:date="2026-10-09T09:00:00Z">
         <w:r>
           <w:rPr>
             <w:rFonts w:cs="Times New Roman"/>
@@ -10025,7 +9880,7 @@
         </w:rPr>
         <w:t xml:space="preserve">(v) Hồ sơ năng lực pháp lý của Bên B: Giấy chứng nhận đăng ký doanh nghiệp có ngành nghề thu gom, vận chuyển chất thải không nguy hại/chất thải rắn xây dựng</w:t>
       </w:r>
-      <w:ins w:id="9022" w:author="BCH Yên Sở" w:date="2026-10-09T09:00:00Z">
+      <w:ins w:id="9011" w:author="BCH Yên Sở" w:date="2026-10-09T09:00:00Z">
         <w:r>
           <w:rPr>
             <w:rFonts w:cs="Times New Roman"/>
@@ -10073,7 +9928,7 @@
         </w:rPr>
         <w:t xml:space="preserve">(vi) Kết quả phân tích, phân định mùn khoan cọc khoan nhồi theo QCVN 07:2025/BTNMT do đơn vị có chức năng quan trắc, phân tích môi trường thực hiện.</w:t>
       </w:r>
-      <w:ins w:id="9023" w:author="BCH Yên Sở" w:date="2026-10-09T09:00:00Z">
+      <w:ins w:id="9012" w:author="BCH Yên Sở" w:date="2026-10-09T09:00:00Z">
         <w:r>
           <w:rPr>
             <w:rFonts w:cs="Times New Roman"/>
@@ -10143,7 +9998,7 @@
         </w:rPr>
         <w:t xml:space="preserve">c) </w:t>
       </w:r>
-      <w:del w:id="9024" w:author="BCH Yên Sở" w:date="2026-10-09T09:00:00Z">
+      <w:del w:id="9013" w:author="BCH Yên Sở" w:date="2026-10-09T09:00:00Z">
         <w:r>
           <w:rPr>
             <w:rFonts w:cs="Times New Roman"/>
@@ -10155,7 +10010,7 @@
           <w:delText xml:space="preserve">Hàng tuần, và kèm theo mỗi bộ hồ sơ thanh toán, Bên B</w:delText>
         </w:r>
       </w:del>
-      <w:ins w:id="9025" w:author="BCH Yên Sở" w:date="2026-10-09T09:00:00Z">
+      <w:ins w:id="9014" w:author="BCH Yên Sở" w:date="2026-10-09T09:00:00Z">
         <w:r>
           <w:rPr>
             <w:rFonts w:cs="Times New Roman"/>
@@ -10200,7 +10055,7 @@
         </w:rPr>
         <w:t xml:space="preserve">(i) </w:t>
       </w:r>
-      <w:del w:id="9026" w:author="BCH Yên Sở" w:date="2026-10-09T09:00:00Z">
+      <w:del w:id="9015" w:author="BCH Yên Sở" w:date="2026-10-09T09:00:00Z">
         <w:r>
           <w:rPr>
             <w:rFonts w:cs="Times New Roman"/>
@@ -10212,7 +10067,7 @@
           <w:delText xml:space="preserve">phiếu hoặc biên nhận</w:delText>
         </w:r>
       </w:del>
-      <w:ins w:id="9027" w:author="BCH Yên Sở" w:date="2026-10-09T09:00:00Z">
+      <w:ins w:id="9016" w:author="BCH Yên Sở" w:date="2026-10-09T09:00:00Z">
         <w:r>
           <w:rPr>
             <w:rFonts w:cs="Times New Roman"/>
@@ -10234,7 +10089,7 @@
         </w:rPr>
         <w:t xml:space="preserve"> tiếp nhận của Bãi Đổ Thải cho từng chuyến xe</w:t>
       </w:r>
-      <w:ins w:id="9028" w:author="BCH Yên Sở" w:date="2026-10-09T09:00:00Z">
+      <w:ins w:id="9017" w:author="BCH Yên Sở" w:date="2026-10-09T09:00:00Z">
         <w:r>
           <w:rPr>
             <w:rFonts w:cs="Times New Roman"/>
@@ -10279,7 +10134,7 @@
         </w:rPr>
         <w:t xml:space="preserve">(ii) biên bản xác nhận khối lượng tiếp nhận trong kỳ có ký, đóng dấu của chủ Bãi Đổ Thải</w:t>
       </w:r>
-      <w:ins w:id="9029" w:author="BCH Yên Sở" w:date="2026-10-09T09:00:00Z">
+      <w:ins w:id="9018" w:author="BCH Yên Sở" w:date="2026-10-09T09:00:00Z">
         <w:r>
           <w:rPr>
             <w:rFonts w:cs="Times New Roman"/>
@@ -10324,7 +10179,7 @@
         </w:rPr>
         <w:t xml:space="preserve">(iii) bản sao hóa đơn giá trị gia tăng hợp pháp do chủ Bãi Đổ Thải hoặc đơn vị xử lý xuất cho Bên B đối với khối lượng tiếp nhận trong kỳ, kèm chứng từ thanh toán</w:t>
       </w:r>
-      <w:ins w:id="9030" w:author="BCH Yên Sở" w:date="2026-10-09T09:00:00Z">
+      <w:ins w:id="9019" w:author="BCH Yên Sở" w:date="2026-10-09T09:00:00Z">
         <w:r>
           <w:rPr>
             <w:rFonts w:cs="Times New Roman"/>
@@ -10370,7 +10225,7 @@
         </w:rPr>
         <w:t xml:space="preserve">(iv) phiếu xuất Chất Thải tại cổng công trường cho từng chuyến (biển số xe, giờ xuất, chủng loại, khối lượng ước tính, Bãi Đổ Thải đến) có chữ ký của lái xe/đại diện Bên B và nhân sự kiểm soát cổng, kèm dữ liệu hành trình GPS thể hiện phương tiện đến đúng Bãi Đổ Thải đã chấp thuận</w:t>
       </w:r>
-      <w:ins w:id="9031" w:author="BCH Yên Sở" w:date="2026-10-09T09:00:00Z">
+      <w:ins w:id="9020" w:author="BCH Yên Sở" w:date="2026-10-09T09:00:00Z">
         <w:r>
           <w:rPr>
             <w:rFonts w:cs="Times New Roman"/>
@@ -10400,7 +10255,7 @@
         <w:widowControl w:val="0"/>
         <w:spacing w:line="276" w:lineRule="auto"/>
         <w:rPr>
-          <w:ins w:id="9032" w:author="BCH Yên Sở" w:date="2026-10-09T09:00:00Z"/>
+          <w:ins w:id="9021" w:author="BCH Yên Sở" w:date="2026-10-09T09:00:00Z"/>
           <w:rFonts w:cs="Times New Roman"/>
           <w:color w:val="000000" w:themeColor="text1"/>
           <w:sz w:val="25"/>
@@ -10408,7 +10263,7 @@
           <w:lang w:val="en-US"/>
         </w:rPr>
       </w:pPr>
-      <w:ins w:id="9033" w:author="BCH Yên Sở" w:date="2026-10-09T09:00:00Z">
+      <w:ins w:id="9022" w:author="BCH Yên Sở" w:date="2026-10-09T09:00:00Z">
         <w:r>
           <w:rPr>
             <w:rFonts w:cs="Times New Roman"/>
@@ -10444,7 +10299,7 @@
         </w:rPr>
         <w:t xml:space="preserve">d) Khối lượng đổ thải ghi trên chứng từ được đối chiếu với khối lượng đào đã được nghiệm thu theo khoản 6.2(c), quy đổi </w:t>
       </w:r>
-      <w:del w:id="9034" w:author="BCH Yên Sở" w:date="2026-10-09T09:00:00Z">
+      <w:del w:id="9023" w:author="BCH Yên Sở" w:date="2026-10-09T09:00:00Z">
         <w:r>
           <w:rPr>
             <w:rFonts w:cs="Times New Roman"/>
@@ -10456,7 +10311,7 @@
           <w:delText xml:space="preserve">theo hệ số chuyển đổi do Hai Bên thống nhất</w:delText>
         </w:r>
       </w:del>
-      <w:ins w:id="9035" w:author="BCH Yên Sở" w:date="2026-10-09T09:00:00Z">
+      <w:ins w:id="9024" w:author="BCH Yên Sở" w:date="2026-10-09T09:00:00Z">
         <w:r>
           <w:rPr>
             <w:rFonts w:cs="Times New Roman"/>
@@ -10546,7 +10401,7 @@
         </w:rPr>
         <w:t xml:space="preserve">f) Trường hợp Bãi Đổ Thải bị đình chỉ, hết công suất hoặc ngừng tiếp nhận, Bên B phải tự bố trí Bãi Đổ Thải thay thế hợp pháp (trình phê duyệt theo điểm a) mà không được điều chỉnh Đơn giá, không được gia hạn tiến độ</w:t>
       </w:r>
-      <w:ins w:id="9036" w:author="BCH Yên Sở" w:date="2026-10-09T09:00:00Z">
+      <w:ins w:id="9025" w:author="BCH Yên Sở" w:date="2026-10-09T09:00:00Z">
         <w:r>
           <w:rPr>
             <w:rFonts w:cs="Times New Roman"/>
@@ -10656,7 +10511,7 @@
         </w:rPr>
         <w:t xml:space="preserve">Khi nhận được thông tin, văn bản của cơ quan có thẩm quyền, Chủ đầu tư hoặc </w:t>
       </w:r>
-      <w:del w:id="9037" w:author="BCH Yên Sở" w:date="2026-10-09T09:00:00Z">
+      <w:del w:id="9026" w:author="BCH Yên Sở" w:date="2026-10-09T09:00:00Z">
         <w:r>
           <w:rPr>
             <w:rFonts w:cs="Times New Roman"/>
@@ -10669,7 +10524,7 @@
           <w:delText xml:space="preserve">phản ánh có căn cứ</w:delText>
         </w:r>
       </w:del>
-      <w:ins w:id="9038" w:author="BCH Yên Sở" w:date="2026-10-09T09:00:00Z">
+      <w:ins w:id="9027" w:author="BCH Yên Sở" w:date="2026-10-09T09:00:00Z">
         <w:r>
           <w:rPr>
             <w:rFonts w:cs="Times New Roman"/>
@@ -10693,7 +10548,7 @@
         </w:rPr>
         <w:t xml:space="preserve"> về việc Chất Thải do Bên B vận chuyển bị đổ không đúng quy định, Bên A có quyền tạm dừng ngay công tác vận chuyển; tạm giữ giá trị thanh toán tương ứng thiệt hại ước tính; thuê đơn vị khác thực hiện và khấu trừ chi phí vào các khoản phải trả cho Bên B mà không phải chịu bất kỳ trách nhiệm nào đối với Bên B.</w:t>
       </w:r>
-      <w:ins w:id="9039" w:author="BCH Yên Sở" w:date="2026-10-09T09:00:00Z">
+      <w:ins w:id="9028" w:author="BCH Yên Sở" w:date="2026-10-09T09:00:00Z">
         <w:r>
           <w:rPr>
             <w:rFonts w:cs="Times New Roman"/>
@@ -12679,7 +12534,7 @@
         </w:rPr>
         <w:t xml:space="preserve">, xả mùn khoan, dung dịch bentonite/polymer, nước thải chưa xử lý ra môi trường hoặc sử dụng chứng từ đổ thải không hợp pháp (chỉ cần 01 lần vi phạm</w:t>
       </w:r>
-      <w:ins w:id="9040" w:author="BCH Yên Sở" w:date="2026-10-09T09:00:00Z">
+      <w:ins w:id="9029" w:author="BCH Yên Sở" w:date="2026-10-09T09:00:00Z">
         <w:r>
           <w:rPr>
             <w:rFonts w:cs="Times New Roman"/>
@@ -14930,7 +14785,7 @@
         </w:rPr>
         <w:t xml:space="preserve">h) Xả mùn khoan, dung dịch bentonite/polymer, nước thải chưa xử lý ra hệ thống thoát nước, ao hồ, môi trường; vận chuyển mùn khoan chưa xử lý tách nước gây chảy tràn, rơi vãi; không cung cấp hoặc cung cấp không đầy đủ dữ liệu hành trình (GPS), Chứng Từ Đổ Thải Hợp Lệ theo khoản 8.3</w:t>
       </w:r>
-      <w:ins w:id="9041" w:author="BCH Yên Sở" w:date="2026-10-09T09:00:00Z">
+      <w:ins w:id="9030" w:author="BCH Yên Sở" w:date="2026-10-09T09:00:00Z">
         <w:r>
           <w:rPr>
             <w:rFonts w:cs="Times New Roman"/>
@@ -19292,10 +19147,10 @@
       <w:pPr>
         <w:spacing w:after="40"/>
         <w:rPr>
-          <w:ins w:id="9042" w:author="BCH Yên Sở" w:date="2026-10-09T09:00:00Z"/>
-        </w:rPr>
-      </w:pPr>
-      <w:ins w:id="9043" w:author="BCH Yên Sở" w:date="2026-10-09T09:00:00Z">
+          <w:ins w:id="9031" w:author="BCH Yên Sở" w:date="2026-10-09T09:00:00Z"/>
+        </w:rPr>
+      </w:pPr>
+      <w:ins w:id="9032" w:author="BCH Yên Sở" w:date="2026-10-09T09:00:00Z">
         <w:r>
           <w:rPr>
             <w:rFonts w:cs="Times New Roman"/>

</xml_diff>